<commit_message>
WordTableBuilder: render via TableGrid style at 100% width
  Replace the host-style heuristic with a simpler model: tables always reference
  Word's built-in TableGrid style and render at 100% page width via tblW pct=5000.
  TableGridStyle.EnsurePresent inserts both TableNormal (cell margins) and
  TableGrid (borders, basedOn TableNormal) into the host's styles part if absent —
  the same shape Word writes when a table is inserted from the ribbon. Existing
  definitions of either style are left untouched so template customizations
  survive. Standalone Build() (no MainDocumentPart) keeps inline borders since
  there's no styles part to add to.

  Fixes the prior heuristic mistreating Word's stock TableNormal (which ships
  with <w:tblCellMar> but no borders) as "customized", which suppressed
  Excelsior's own borders and produced borderless tables for every Word-authored
  template.
</commit_message>
<xml_diff>
--- a/src/Excelsior.Tests/Word/WordTableBuilderTests.ColumnHeadingStyleOverridesTableHeadingStyle.verified.docx
+++ b/src/Excelsior.Tests/Word/WordTableBuilderTests.ColumnHeadingStyleOverridesTableHeadingStyle.verified.docx
@@ -4,20 +4,8 @@
   <w:body>
     <w:tbl>
       <w:tblPr>
-        <w:tblBorders>
-          <w:top w:val="single" w:sz="4"/>
-          <w:bottom w:val="single" w:sz="4"/>
-          <w:left w:val="single" w:sz="4"/>
-          <w:right w:val="single" w:sz="4"/>
-          <w:insideH w:val="single" w:sz="4"/>
-          <w:insideV w:val="single" w:sz="4"/>
-        </w:tblBorders>
-        <w:tblCellMar>
-          <w:top w:w="0" w:type="dxa"/>
-          <w:start w:w="108" w:type="dxa"/>
-          <w:bottom w:w="0" w:type="dxa"/>
-          <w:end w:w="108" w:type="dxa"/>
-        </w:tblCellMar>
+        <w:tblStyle w:val="TableGrid"/>
+        <w:tblW w:w="5000" w:type="pct"/>
         <w:tblLook w:val="04A0" w:firstRow="true" w:lastRow="false" w:firstColumn="false" w:lastColumn="false" w:noHBand="false" w:noVBand="true"/>
       </w:tblPr>
       <w:tblGrid>
@@ -354,4 +342,42 @@
     </w:sectPr>
   </w:body>
 </w:document>
+</file>
+
+<file path=word/styles.xml><?xml version="1.0" encoding="utf-8"?>
+<w:styles xmlns:w="http://schemas.openxmlformats.org/wordprocessingml/2006/main">
+  <w:style w:type="table" w:styleId="TableNormal" w:default="true">
+    <w:name w:val="Normal Table"/>
+    <w:uiPriority w:val="99"/>
+    <w:semiHidden/>
+    <w:unhideWhenUsed/>
+    <w:tblPr>
+      <w:tblInd w:w="0" w:type="dxa"/>
+      <w:tblCellMar>
+        <w:top w:w="0" w:type="dxa"/>
+        <w:start w:w="108" w:type="dxa"/>
+        <w:bottom w:w="0" w:type="dxa"/>
+        <w:end w:w="108" w:type="dxa"/>
+      </w:tblCellMar>
+    </w:tblPr>
+  </w:style>
+  <w:style w:type="table" w:styleId="TableGrid">
+    <w:name w:val="Table Grid"/>
+    <w:basedOn w:val="TableNormal"/>
+    <w:uiPriority w:val="39"/>
+    <w:pPr>
+      <w:spacing w:after="0" w:line="240" w:lineRule="auto"/>
+    </w:pPr>
+    <w:tblPr>
+      <w:tblBorders>
+        <w:top w:val="single" w:color="auto" w:sz="4" w:space="0"/>
+        <w:left w:val="single" w:color="auto" w:sz="4" w:space="0"/>
+        <w:bottom w:val="single" w:color="auto" w:sz="4" w:space="0"/>
+        <w:right w:val="single" w:color="auto" w:sz="4" w:space="0"/>
+        <w:insideH w:val="single" w:color="auto" w:sz="4" w:space="0"/>
+        <w:insideV w:val="single" w:color="auto" w:sz="4" w:space="0"/>
+      </w:tblBorders>
+    </w:tblPr>
+  </w:style>
+</w:styles>
 </file>
</xml_diff>

<commit_message>
Default Word table heading alignment to left
</commit_message>
<xml_diff>
--- a/src/Excelsior.Tests/Word/WordTableBuilderTests.ColumnHeadingStyleOverridesTableHeadingStyle.verified.docx
+++ b/src/Excelsior.Tests/Word/WordTableBuilderTests.ColumnHeadingStyleOverridesTableHeadingStyle.verified.docx
@@ -24,7 +24,7 @@
           </w:tcPr>
           <w:p>
             <w:pPr>
-              <w:jc w:val="center"/>
+              <w:jc w:val="left"/>
             </w:pPr>
             <w:r>
               <w:rPr>
@@ -40,7 +40,7 @@
           </w:tcPr>
           <w:p>
             <w:pPr>
-              <w:jc w:val="center"/>
+              <w:jc w:val="left"/>
             </w:pPr>
             <w:r>
               <w:rPr>
@@ -56,7 +56,7 @@
           </w:tcPr>
           <w:p>
             <w:pPr>
-              <w:jc w:val="center"/>
+              <w:jc w:val="left"/>
             </w:pPr>
             <w:r>
               <w:rPr>
@@ -72,7 +72,7 @@
           </w:tcPr>
           <w:p>
             <w:pPr>
-              <w:jc w:val="center"/>
+              <w:jc w:val="left"/>
             </w:pPr>
             <w:r>
               <w:rPr>
@@ -88,7 +88,7 @@
           </w:tcPr>
           <w:p>
             <w:pPr>
-              <w:jc w:val="center"/>
+              <w:jc w:val="left"/>
             </w:pPr>
             <w:r>
               <w:rPr>
@@ -104,7 +104,7 @@
           </w:tcPr>
           <w:p>
             <w:pPr>
-              <w:jc w:val="center"/>
+              <w:jc w:val="left"/>
             </w:pPr>
             <w:r>
               <w:rPr>
@@ -120,7 +120,7 @@
           </w:tcPr>
           <w:p>
             <w:pPr>
-              <w:jc w:val="center"/>
+              <w:jc w:val="left"/>
             </w:pPr>
             <w:r>
               <w:rPr>

</xml_diff>

<commit_message>
Default Word table heading alignment to left (#189)
</commit_message>
<xml_diff>
--- a/src/Excelsior.Tests/Word/WordTableBuilderTests.ColumnHeadingStyleOverridesTableHeadingStyle.verified.docx
+++ b/src/Excelsior.Tests/Word/WordTableBuilderTests.ColumnHeadingStyleOverridesTableHeadingStyle.verified.docx
@@ -24,7 +24,7 @@
           </w:tcPr>
           <w:p>
             <w:pPr>
-              <w:jc w:val="center"/>
+              <w:jc w:val="left"/>
             </w:pPr>
             <w:r>
               <w:rPr>
@@ -40,7 +40,7 @@
           </w:tcPr>
           <w:p>
             <w:pPr>
-              <w:jc w:val="center"/>
+              <w:jc w:val="left"/>
             </w:pPr>
             <w:r>
               <w:rPr>
@@ -56,7 +56,7 @@
           </w:tcPr>
           <w:p>
             <w:pPr>
-              <w:jc w:val="center"/>
+              <w:jc w:val="left"/>
             </w:pPr>
             <w:r>
               <w:rPr>
@@ -72,7 +72,7 @@
           </w:tcPr>
           <w:p>
             <w:pPr>
-              <w:jc w:val="center"/>
+              <w:jc w:val="left"/>
             </w:pPr>
             <w:r>
               <w:rPr>
@@ -88,7 +88,7 @@
           </w:tcPr>
           <w:p>
             <w:pPr>
-              <w:jc w:val="center"/>
+              <w:jc w:val="left"/>
             </w:pPr>
             <w:r>
               <w:rPr>
@@ -104,7 +104,7 @@
           </w:tcPr>
           <w:p>
             <w:pPr>
-              <w:jc w:val="center"/>
+              <w:jc w:val="left"/>
             </w:pPr>
             <w:r>
               <w:rPr>
@@ -120,7 +120,7 @@
           </w:tcPr>
           <w:p>
             <w:pPr>
-              <w:jc w:val="center"/>
+              <w:jc w:val="left"/>
             </w:pPr>
             <w:r>
               <w:rPr>

</xml_diff>